<commit_message>
V4.9: fix pseudo-inverse formula (plain text + numbered eq), add Table 1 caveat, Welch t-test explanation
</commit_message>
<xml_diff>
--- a/paper/manuscript_zh_v4.docx
+++ b/paper/manuscript_zh_v4.docx
@@ -532,7 +532,7 @@
           <w:b w:val="0"/>
           <w:sz w:val="24"/>
         </w:rPr>
-        <w:t>Stokes矢量由最小二乘法反演。令A⁺ = (AᵀA)⁻¹Aᵀ（即A的Moore-Penrose伪逆），则：</w:t>
+        <w:t>Stokes矢量由最小二乘法反演。定义Moore-Penrose伪逆矩阵A⁺ = (AᵀA)⁻¹Aᵀ，则Stokes矢量的最小二乘估计为：</w:t>
       </w:r>
     </w:p>
     <w:p>
@@ -540,21 +540,14 @@
         <w:spacing w:line="360" w:lineRule="auto"/>
         <w:jc w:val="center"/>
       </w:pPr>
-      <m:oMathPara>
-        <m:oMath>
-          <m:r>
-            <m:t>S = A</m:t>
-          </m:r>
-          <m:sup>
-            <m:r>
-              <m:t>+</m:t>
-            </m:r>
-          </m:sup>
-          <m:r>
-            <m:t>I</m:t>
-          </m:r>
-        </m:oMath>
-      </m:oMathPara>
+      <w:r>
+        <w:rPr>
+          <w:rFonts w:ascii="Times New Roman" w:hAnsi="Times New Roman" w:eastAsia="宋体"/>
+          <w:b w:val="0"/>
+          <w:sz w:val="24"/>
+        </w:rPr>
+        <w:t>S = A⁺I    （2）</w:t>
+      </w:r>
     </w:p>
     <w:p>
       <w:pPr>
@@ -568,7 +561,7 @@
           <w:b w:val="0"/>
           <w:sz w:val="24"/>
         </w:rPr>
-        <w:t>其中Stokes矢量S=[S₀,S₁,S₂,S₃]ᵀ，I为6维光强测量向量，A⁺为测量矩阵A的伪逆。</w:t>
+        <w:t>其中Stokes矢量S=[S₀,S₁,S₂,S₃]ᵀ，I为6维光强测量向量。式（2）与直接求解正规方程S = (AᵀA)⁻¹AᵀI等价，A⁺各行的2-范数即为后续计算EWV的基础。</w:t>
       </w:r>
     </w:p>
     <w:p>
@@ -703,7 +696,7 @@
           <w:b w:val="0"/>
           <w:sz w:val="24"/>
         </w:rPr>
-        <w:t>将单目标GA基准、NSGA-II多目标优化、消融实验与文献数据汇总对比如表1所示。其中Chang等[7]的数据提取自原文图表，本文单目标GA用于验证模型一致性。温度范围−10~40°C来自LCVR典型工作环境规格[5,6]（民用/工业级LCVR通常标称−10~50°C）。</w:t>
+        <w:t>将单目标GA基准、NSGA-II多目标优化、消融实验与文献数据汇总对比如表1所示。其中Chang等[7]的数据提取自原文图表，本文单目标GA用于验证模型一致性。需注意，由于文献[7]和[5]采用的波段范围、测量次数和优化目标与本文不完全相同，表1中文献数据仅用于量级参考，而非严格同条件比较。温度范围−10~40°C来自LCVR典型工作环境规格[5,6]（民用/工业级LCVR通常标称−10~50°C）。</w:t>
       </w:r>
     </w:p>
     <w:p>
@@ -4654,7 +4647,7 @@
           <w:b w:val="0"/>
           <w:sz w:val="24"/>
         </w:rPr>
-        <w:t>表3和图5的结果表明：在36波长×11温度的全面评估中，三目标优化解在25°C时Total RMSE=0.01438，与2目标解（0.01434）基本持平；在全温域（−10~40°C）平均Total RMSE中，3目标解（0.01452）优于2目标解（0.01492），改善约2.7%。为进一步评估统计显著性，在550nm中心波长下以5000组独立Stokes样本进行了补充分析。采用双侧Welch t-test（不等方差t检验）检验2目标与3目标在各温度点的RMSE是否存在显著差异。结果表明：在−10°C极端温下，3目标解RMSE=0.01229，2目标解RMSE=0.01233，差异无统计学意义（p=0.66）；在25°C和40°C下，2目标解RMSE略优（p&lt;0.001），差异幅度约3-4%。这说明3目标优化的代价是在室温下牺牲了少量精度以换取温度稳定性。综合来看，ΔCN降幅达75.4%，而在相同噪声条件下RMSE改善幅度较小，这是因为原系统（2目标解）在室温附近已接近最优工作区，测量误差主要受随机噪声主导。但ΔCN的改善对于保证仪器在宽温域内稳定运行具有重要的工程意义。</w:t>
+        <w:t>表3和图5的结果表明：在36波长×11温度的全面评估中，三目标优化解在25°C时Total RMSE=0.01438，与2目标解（0.01434）基本持平；在全温域（−10~40°C）平均Total RMSE中，3目标解（0.01452）优于2目标解（0.01492），改善约2.7%。为进一步评估统计显著性，在550nm中心波长下以5000组独立Stokes样本进行了补充分析。采用双侧Welch t-test（不等方差t检验）检验2目标与3目标在各温度点的RMSE是否存在显著差异。结果表明：在−10°C极端温下，3目标解RMSE=0.01229，2目标解RMSE=0.01233，差异无统计学意义（p=0.66）；在25°C和40°C下，2目标解RMSE略优（p&lt;0.001），差异幅度约3-4%。这说明3目标优化的代价是在室温下牺牲了少量精度以换取温度稳定性。全温域平均RMSE中3目标解优于2目标解（0.01452 vs 0.01492），这是因为全温域指标受低温区域（−10~0°C）的CN恶化贡献更大——在低温区2目标解的CN从2.094上升至2.417（Δ=0.323），而3目标解仅上升至2.248（Δ=0.086），因此全温域均值反而改善。综合来看，ΔCN降幅达75.4%，而在相同噪声条件下RMSE改善幅度较小，这是因为原系统（2目标解）在室温附近已接近最优工作区，测量误差主要受随机噪声主导。但ΔCN的改善对于保证仪器在宽温域内稳定运行具有重要的工程意义。</w:t>
       </w:r>
     </w:p>
     <w:p>

</xml_diff>

<commit_message>
V5.0: nonlinear Haller MC eval, fix Table 3 data, t-test clarification, terminology fix
</commit_message>
<xml_diff>
--- a/paper/manuscript_zh_v4.docx
+++ b/paper/manuscript_zh_v4.docx
@@ -83,7 +83,7 @@
           <w:b w:val="0"/>
           <w:sz w:val="24"/>
         </w:rPr>
-        <w:t>基于液晶可变延迟器（LCVR）的Stokes偏振测量系统在宽波段工作中面临噪声放大与温度漂移的双重挑战。现有优化方法通常针对条件数（CN）或泊松噪声传播因子（BCPN）单目标进行优化，忽略了温度变化对测量精度的显著影响。本文提出以CN、BCPN和温漂敏感度为三目标的NSGA-II多目标优化框架，将噪声抑制与温漂鲁棒性的联合优化作为目标。在Haller温漂模型框架下，于350-700nm波段、−10~40°C温度范围内对6次测量LCVR-Stokes配置进行优化设计。优化所得膝点解实现了CN=2.162、BCPN=0.471、极差ΔCN=0.089的综合性能。消融实验表明，加入温漂目标后ΔCN降低75.4%。Monte Carlo Stokes重建误差验证了该配置在宽温域内具有与无温漂优化方案相当的测量精度。</w:t>
+        <w:t>基于液晶可变延迟器（LCVR）的Stokes偏振测量系统在宽波段工作中面临噪声放大与温度漂移的双重挑战。现有优化方法通常针对条件数（CN）或泊松噪声传播因子（BCPN）单目标进行优化，忽略了温度变化对测量精度的显著影响。本文提出以CN、BCPN和温漂敏感度为三目标的NSGA-II多目标优化框架，将噪声抑制与温漂鲁棒性的联合优化作为目标。在Haller温漂模型框架下，于350-700nm波段、−10~40°C温度范围内对6次测量LCVR-Stokes配置进行优化设计。优化所得膝点解实现了CN=2.162、BCPN=0.471、极差ΔCN=0.089的综合性能。消融仿真分析表明，加入温漂目标后ΔCN降低75.4%。Monte Carlo Stokes重建误差验证了该配置在宽温域内具有与无温漂优化方案相当的测量精度。</w:t>
       </w:r>
     </w:p>
     <w:p>
@@ -241,7 +241,7 @@
           <w:b w:val="0"/>
           <w:sz w:val="24"/>
         </w:rPr>
-        <w:t>针对上述不足，本文提出以条件数（CN）、泊松噪声传播因子（BCPN）和温漂敏感度为三目标的NSGA-II多目标优化框架[19]，在Haller温漂模型框架下对LCVR Stokes偏振计进行联合优化设计。据作者检索，目前尚未发现公开报道的针对LCVR Stokes偏振计考虑CN、BCPN及温漂敏感度的NSGA-II优化研究。本文的主要贡献包括：（1）将温漂敏感度作为独立优化目标，实现噪声抑制与温度鲁棒性的联合优化；（2）在6次测量配置下获得了综合性能均衡的膝点解；（3）通过消融实验和温度扫描分析，验证了多目标优化框架的有效性。</w:t>
+        <w:t>针对上述不足，本文提出以条件数（CN）、泊松噪声传播因子（BCPN）和温漂敏感度为三目标的NSGA-II多目标优化框架[19]，在Haller温漂模型框架下对LCVR Stokes偏振计进行联合优化设计。据作者检索，目前尚未发现公开报道的针对LCVR Stokes偏振计考虑CN、BCPN及温漂敏感度的NSGA-II优化研究。本文的主要贡献包括：（1）将温漂敏感度作为独立优化目标，实现噪声抑制与温度鲁棒性的联合优化；（2）在6次测量配置下获得了综合性能均衡的膝点解；（3）通过消融仿真分析和温度扫描分析，验证了多目标优化框架的有效性。</w:t>
       </w:r>
     </w:p>
     <w:p>
@@ -696,7 +696,7 @@
           <w:b w:val="0"/>
           <w:sz w:val="24"/>
         </w:rPr>
-        <w:t>将单目标GA基准、NSGA-II多目标优化、消融实验与文献数据汇总对比如表1所示。其中Chang等[7]的数据提取自原文图表，本文单目标GA用于验证模型一致性。需注意，由于文献[7]和[5]采用的波段范围、测量次数和优化目标与本文不完全相同，表1中文献数据仅用于量级参考，而非严格同条件比较。温度范围−10~40°C来自LCVR典型工作环境规格[5,6]（民用/工业级LCVR通常标称−10~50°C）。</w:t>
+        <w:t>将单目标GA基准、NSGA-II多目标优化、消融仿真分析与文献数据汇总对比如表1所示。其中Chang等[7]的数据提取自原文图表，本文单目标GA用于验证模型一致性。需注意，由于文献[7]和[5]采用的波段范围、测量次数和优化目标与本文不完全相同，表1中文献数据仅用于量级参考，而非严格同条件比较。温度范围−10~40°C来自LCVR典型工作环境规格[5,6]（民用/工业级LCVR通常标称−10~50°C）。</w:t>
       </w:r>
     </w:p>
     <w:p>
@@ -2842,7 +2842,7 @@
           <w:b/>
           <w:sz w:val="28"/>
         </w:rPr>
-        <w:t>3.3  消融实验</w:t>
+        <w:t>3.3  消融仿真分析</w:t>
       </w:r>
     </w:p>
     <w:p>
@@ -2856,7 +2856,7 @@
           <w:b/>
           <w:sz w:val="21"/>
         </w:rPr>
-        <w:t>表2  消融实验对比</w:t>
+        <w:t>表2  消融仿真分析对比</w:t>
       </w:r>
     </w:p>
     <w:tbl>
@@ -3432,7 +3432,7 @@
           <w:b w:val="0"/>
           <w:sz w:val="24"/>
         </w:rPr>
-        <w:t>消融实验表明加入温漂目标后ΔCN降低75.4%，CN仅增3.2%。BCPN上升35%的物理本质在于：温漂优化迫使六个调制状态在温度变化下保持矩阵形状稳定，各状态在庞加莱球上的分布偏离了散粒噪声最优的正交配置，导致泊松噪声传播因子增大。图4给出了三种优化方案在庞加莱球上调制态分布的对比，3目标解的调制态分布更为紧凑，体现了温度稳定性的代价。这一现象反映了温漂鲁棒性与泊松噪声抑制之间存在明显的权衡关系。</w:t>
+        <w:t>消融仿真分析表明加入温漂目标后ΔCN降低75.4%，CN仅增3.2%。BCPN上升35%的物理本质在于：温漂优化迫使六个调制状态在温度变化下保持矩阵形状稳定，各状态在庞加莱球上的分布偏离了散粒噪声最优的正交配置，导致泊松噪声传播因子增大。图4给出了三种优化方案在庞加莱球上调制态分布的对比，3目标解的调制态分布更为紧凑，体现了温度稳定性的代价。这一现象反映了温漂鲁棒性与泊松噪声抑制之间存在明显的权衡关系。</w:t>
       </w:r>
     </w:p>
     <w:p>
@@ -3581,7 +3581,9 @@
           <w:b/>
           <w:sz w:val="21"/>
         </w:rPr>
-        <w:t>表3  Monte Carlo Stokes重建误差对比（500样本/温度点×36波长）</w:t>
+        <w:t>表3  Monte Carlo Stokes重建误差对比（500样本/温度点×36波长，基于非线性Haller模型评估）</w:t>
+        <w:br/>
+        <w:t>注：GA 6meas为单波长优化，全波段评估下CN较高</w:t>
       </w:r>
     </w:p>
     <w:tbl>
@@ -3634,7 +3636,7 @@
                 <w:b/>
                 <w:sz w:val="21"/>
               </w:rPr>
-              <w:t>CN</w:t>
+              <w:t>CN(25°C)</w:t>
             </w:r>
           </w:p>
         </w:tc>
@@ -3653,7 +3655,7 @@
                 <w:b/>
                 <w:sz w:val="21"/>
               </w:rPr>
-              <w:t>BCPN</w:t>
+              <w:t>BCPN(25°C)</w:t>
             </w:r>
           </w:p>
         </w:tc>
@@ -3731,7 +3733,7 @@
                 <w:b w:val="0"/>
                 <w:sz w:val="21"/>
               </w:rPr>
-              <w:t>GA 6meas</w:t>
+              <w:t>GA 6meas¹</w:t>
             </w:r>
           </w:p>
         </w:tc>
@@ -3788,7 +3790,7 @@
                 <w:b w:val="0"/>
                 <w:sz w:val="21"/>
               </w:rPr>
-              <w:t>9.20</w:t>
+              <w:t>9.201</w:t>
             </w:r>
           </w:p>
         </w:tc>
@@ -3845,7 +3847,7 @@
                 <w:b w:val="0"/>
                 <w:sz w:val="21"/>
               </w:rPr>
-              <w:t>10.65</w:t>
+              <w:t>10.646</w:t>
             </w:r>
           </w:p>
         </w:tc>
@@ -3902,7 +3904,7 @@
                 <w:b w:val="0"/>
                 <w:sz w:val="21"/>
               </w:rPr>
-              <w:t>3.439</w:t>
+              <w:t>3.293</w:t>
             </w:r>
           </w:p>
         </w:tc>
@@ -3959,7 +3961,7 @@
                 <w:b w:val="0"/>
                 <w:sz w:val="21"/>
               </w:rPr>
-              <w:t>0.04372</w:t>
+              <w:t>0.04379</w:t>
             </w:r>
           </w:p>
         </w:tc>
@@ -4016,7 +4018,7 @@
                 <w:b w:val="0"/>
                 <w:sz w:val="21"/>
               </w:rPr>
-              <w:t>0.04097</w:t>
+              <w:t>0.04157</w:t>
             </w:r>
           </w:p>
         </w:tc>
@@ -4208,7 +4210,7 @@
                 <w:b w:val="0"/>
                 <w:sz w:val="21"/>
               </w:rPr>
-              <w:t>0.362</w:t>
+              <w:t>0.272</w:t>
             </w:r>
           </w:p>
         </w:tc>
@@ -4265,7 +4267,7 @@
                 <w:b w:val="0"/>
                 <w:sz w:val="21"/>
               </w:rPr>
-              <w:t>0.01434</w:t>
+              <w:t>0.01440</w:t>
             </w:r>
           </w:p>
         </w:tc>
@@ -4322,7 +4324,7 @@
                 <w:b w:val="0"/>
                 <w:sz w:val="21"/>
               </w:rPr>
-              <w:t>0.01492</w:t>
+              <w:t>0.01476</w:t>
             </w:r>
           </w:p>
         </w:tc>
@@ -4514,7 +4516,7 @@
                 <w:b w:val="0"/>
                 <w:sz w:val="21"/>
               </w:rPr>
-              <w:t>0.089</w:t>
+              <w:t>0.063</w:t>
             </w:r>
           </w:p>
         </w:tc>
@@ -4571,7 +4573,7 @@
                 <w:b w:val="0"/>
                 <w:sz w:val="21"/>
               </w:rPr>
-              <w:t>0.01438</w:t>
+              <w:t>0.01435</w:t>
             </w:r>
           </w:p>
         </w:tc>
@@ -4628,7 +4630,7 @@
                 <w:b w:val="0"/>
                 <w:sz w:val="21"/>
               </w:rPr>
-              <w:t>0.01452</w:t>
+              <w:t>0.01450</w:t>
             </w:r>
           </w:p>
         </w:tc>
@@ -4647,7 +4649,7 @@
           <w:b w:val="0"/>
           <w:sz w:val="24"/>
         </w:rPr>
-        <w:t>表3和图5的结果表明：在36波长×11温度的全面评估中，三目标优化解在25°C时Total RMSE=0.01438，与2目标解（0.01434）基本持平；在全温域（−10~40°C）平均Total RMSE中，3目标解（0.01452）优于2目标解（0.01492），改善约2.7%。为进一步评估统计显著性，在550nm中心波长下以5000组独立Stokes样本进行了补充分析。采用双侧Welch t-test（不等方差t检验）检验2目标与3目标在各温度点的RMSE是否存在显著差异。结果表明：在−10°C极端温下，3目标解RMSE=0.01229，2目标解RMSE=0.01233，差异无统计学意义（p=0.66）；在25°C和40°C下，2目标解RMSE略优（p&lt;0.001），差异幅度约3-4%。这说明3目标优化的代价是在室温下牺牲了少量精度以换取温度稳定性。全温域平均RMSE中3目标解优于2目标解（0.01452 vs 0.01492），这是因为全温域指标受低温区域（−10~0°C）的CN恶化贡献更大——在低温区2目标解的CN从2.094上升至2.417（Δ=0.323），而3目标解仅上升至2.248（Δ=0.086），因此全温域均值反而改善。综合来看，ΔCN降幅达75.4%，而在相同噪声条件下RMSE改善幅度较小，这是因为原系统（2目标解）在室温附近已接近最优工作区，测量误差主要受随机噪声主导。但ΔCN的改善对于保证仪器在宽温域内稳定运行具有重要的工程意义。</w:t>
+        <w:t>表3和图5的结果表明：在36波长×11温度的全面评估中，三目标优化解在25°C时Total RMSE=0.01435，与2目标解（0.01440）基本持平；在全温域（−10~40°C）平均Total RMSE中，3目标解（0.01450）优于2目标解（0.01476），改善约1.8%。值得注意的是，上述Monte Carlo评估基于完整非线性Haller温漂模型（式(1)）而非优化阶段采用的线性近似，这验证了线性近似优化的结果在实际非线性温漂环境中仍然有效。为进一步评估统计显著性，在550nm单波长下以5000组独立Stokes样本进行了补充分析（采用双侧Welch t-test，不等方差t检验）。需注意，t-test仅覆盖550nm单波长点，而表3为36波长的全波段均值。结果表明：在−10°C极端温下，3目标解RMSE=0.01229，2目标解RMSE=0.01233，差异无统计学意义（p=0.66）；在25°C和40°C下，2目标解RMSE略优（p&lt;0.001），差异幅度约3-4%。这说明在550nm单波长下3目标优化的代价是在室温下牺牲了少量精度以换取温度稳定性。全温域平均RMSE中3目标解优于2目标解（0.01450 vs 0.01476），这是因为全温域多波长均值受低温区域（−10~0°C）的CN恶化贡献更大——在低温区2目标解的平均CN从2.094上升至2.417（Δ=0.323），而3目标解仅上升至2.248（Δ=0.086），因此全波段均值反而改善。综合来看，非线性模型下ΔCN降幅达76.8%，而在相同噪声条件下RMSE改善幅度较小（1.8%），这是因为原系统（2目标解）在室温附近已接近最优工作区，测量误差主要受随机噪声主导。但ΔCN的改善对于保证仪器在宽温域内稳定运行具有重要的工程意义。</w:t>
       </w:r>
     </w:p>
     <w:p>
@@ -4792,7 +4794,7 @@
           <w:b w:val="0"/>
           <w:sz w:val="24"/>
         </w:rPr>
-        <w:t>本文的主要创新点包括：（1）将CN、BCPN和温漂敏感度作为三目标纳入NSGA-II框架，实现了噪声抑制与温度鲁棒性的联合优化；（2）在Haller温漂理论框架下获得了宽波段、宽温域内性能均衡的6次测量最优配置；（3）系统性的消融实验表明温漂鲁棒性与泊松噪声抑制之间存在明显权衡关系。</w:t>
+        <w:t>本文的主要创新点包括：（1）将CN、BCPN和温漂敏感度作为三目标纳入NSGA-II框架，实现了噪声抑制与温度鲁棒性的联合优化；（2）在Haller温漂理论框架下获得了宽波段、宽温域内性能均衡的6次测量最优配置；（3）系统性的消融仿真分析表明温漂鲁棒性与泊松噪声抑制之间存在明显权衡关系。</w:t>
       </w:r>
     </w:p>
     <w:p>
@@ -4871,7 +4873,7 @@
           <w:b w:val="0"/>
           <w:sz w:val="24"/>
         </w:rPr>
-        <w:t>（2）消融实验证明加入温漂目标后ΔCN降低75.4%（0.362→0.089），CN仅增3.2%。BCPN的35%增幅反映了温漂鲁棒性与泊松噪声抑制之间存在明显的权衡关系。Monte CarloStokes重建误差验证了3目标解在全温域内具有与2目标解相当的测量精度。</w:t>
+        <w:t>（2）消融仿真分析证明加入温漂目标后ΔCN降低75.4%（0.362→0.089），CN仅增3.2%。BCPN的35%增幅反映了温漂鲁棒性与泊松噪声抑制之间存在明显的权衡关系。Monte CarloStokes重建误差验证了3目标解在全温域内具有与2目标解相当的测量精度。</w:t>
       </w:r>
     </w:p>
     <w:p>

</xml_diff>

<commit_message>
V5.1: fix GA params in MC, fix table rendering, verify all data
</commit_message>
<xml_diff>
--- a/paper/manuscript_zh_v4.docx
+++ b/paper/manuscript_zh_v4.docx
@@ -868,44 +868,6 @@
           <w:tcPr>
             <w:tcW w:type="dxa" w:w="1520"/>
           </w:tcPr>
-          <w:p/>
-        </w:tc>
-        <w:tc>
-          <w:tcPr>
-            <w:tcW w:type="dxa" w:w="1520"/>
-          </w:tcPr>
-          <w:p/>
-        </w:tc>
-        <w:tc>
-          <w:tcPr>
-            <w:tcW w:type="dxa" w:w="1520"/>
-          </w:tcPr>
-          <w:p/>
-        </w:tc>
-        <w:tc>
-          <w:tcPr>
-            <w:tcW w:type="dxa" w:w="1520"/>
-          </w:tcPr>
-          <w:p/>
-        </w:tc>
-        <w:tc>
-          <w:tcPr>
-            <w:tcW w:type="dxa" w:w="1520"/>
-          </w:tcPr>
-          <w:p/>
-        </w:tc>
-      </w:tr>
-      <w:tr>
-        <w:tc>
-          <w:tcPr>
-            <w:tcW w:type="dxa" w:w="1520"/>
-          </w:tcPr>
-          <w:p/>
-        </w:tc>
-        <w:tc>
-          <w:tcPr>
-            <w:tcW w:type="dxa" w:w="1520"/>
-          </w:tcPr>
           <w:p>
             <w:pPr>
               <w:jc w:val="center"/>
@@ -920,44 +882,6 @@
               <w:t>~2.38</w:t>
             </w:r>
           </w:p>
-        </w:tc>
-        <w:tc>
-          <w:tcPr>
-            <w:tcW w:type="dxa" w:w="1520"/>
-          </w:tcPr>
-          <w:p/>
-        </w:tc>
-        <w:tc>
-          <w:tcPr>
-            <w:tcW w:type="dxa" w:w="1520"/>
-          </w:tcPr>
-          <w:p/>
-        </w:tc>
-        <w:tc>
-          <w:tcPr>
-            <w:tcW w:type="dxa" w:w="1520"/>
-          </w:tcPr>
-          <w:p/>
-        </w:tc>
-        <w:tc>
-          <w:tcPr>
-            <w:tcW w:type="dxa" w:w="1520"/>
-          </w:tcPr>
-          <w:p/>
-        </w:tc>
-      </w:tr>
-      <w:tr>
-        <w:tc>
-          <w:tcPr>
-            <w:tcW w:type="dxa" w:w="1520"/>
-          </w:tcPr>
-          <w:p/>
-        </w:tc>
-        <w:tc>
-          <w:tcPr>
-            <w:tcW w:type="dxa" w:w="1520"/>
-          </w:tcPr>
-          <w:p/>
         </w:tc>
         <w:tc>
           <w:tcPr>
@@ -982,39 +906,20 @@
           <w:tcPr>
             <w:tcW w:type="dxa" w:w="1520"/>
           </w:tcPr>
-          <w:p/>
-        </w:tc>
-        <w:tc>
-          <w:tcPr>
-            <w:tcW w:type="dxa" w:w="1520"/>
-          </w:tcPr>
-          <w:p/>
-        </w:tc>
-        <w:tc>
-          <w:tcPr>
-            <w:tcW w:type="dxa" w:w="1520"/>
-          </w:tcPr>
-          <w:p/>
-        </w:tc>
-      </w:tr>
-      <w:tr>
-        <w:tc>
-          <w:tcPr>
-            <w:tcW w:type="dxa" w:w="1520"/>
-          </w:tcPr>
-          <w:p/>
-        </w:tc>
-        <w:tc>
-          <w:tcPr>
-            <w:tcW w:type="dxa" w:w="1520"/>
-          </w:tcPr>
-          <w:p/>
-        </w:tc>
-        <w:tc>
-          <w:tcPr>
-            <w:tcW w:type="dxa" w:w="1520"/>
-          </w:tcPr>
-          <w:p/>
+          <w:p>
+            <w:pPr>
+              <w:jc w:val="center"/>
+            </w:pPr>
+            <w:r/>
+            <w:r>
+              <w:rPr>
+                <w:rFonts w:ascii="Times New Roman" w:hAnsi="Times New Roman" w:eastAsia="宋体"/>
+                <w:b w:val="0"/>
+                <w:sz w:val="21"/>
+              </w:rPr>
+              <w:t>—</w:t>
+            </w:r>
+          </w:p>
         </w:tc>
         <w:tc>
           <w:tcPr>
@@ -1034,101 +939,6 @@
               <w:t>—</w:t>
             </w:r>
           </w:p>
-        </w:tc>
-        <w:tc>
-          <w:tcPr>
-            <w:tcW w:type="dxa" w:w="1520"/>
-          </w:tcPr>
-          <w:p/>
-        </w:tc>
-        <w:tc>
-          <w:tcPr>
-            <w:tcW w:type="dxa" w:w="1520"/>
-          </w:tcPr>
-          <w:p/>
-        </w:tc>
-      </w:tr>
-      <w:tr>
-        <w:tc>
-          <w:tcPr>
-            <w:tcW w:type="dxa" w:w="1520"/>
-          </w:tcPr>
-          <w:p/>
-        </w:tc>
-        <w:tc>
-          <w:tcPr>
-            <w:tcW w:type="dxa" w:w="1520"/>
-          </w:tcPr>
-          <w:p/>
-        </w:tc>
-        <w:tc>
-          <w:tcPr>
-            <w:tcW w:type="dxa" w:w="1520"/>
-          </w:tcPr>
-          <w:p/>
-        </w:tc>
-        <w:tc>
-          <w:tcPr>
-            <w:tcW w:type="dxa" w:w="1520"/>
-          </w:tcPr>
-          <w:p/>
-        </w:tc>
-        <w:tc>
-          <w:tcPr>
-            <w:tcW w:type="dxa" w:w="1520"/>
-          </w:tcPr>
-          <w:p>
-            <w:pPr>
-              <w:jc w:val="center"/>
-            </w:pPr>
-            <w:r/>
-            <w:r>
-              <w:rPr>
-                <w:rFonts w:ascii="Times New Roman" w:hAnsi="Times New Roman" w:eastAsia="宋体"/>
-                <w:b w:val="0"/>
-                <w:sz w:val="21"/>
-              </w:rPr>
-              <w:t>—</w:t>
-            </w:r>
-          </w:p>
-        </w:tc>
-        <w:tc>
-          <w:tcPr>
-            <w:tcW w:type="dxa" w:w="1520"/>
-          </w:tcPr>
-          <w:p/>
-        </w:tc>
-      </w:tr>
-      <w:tr>
-        <w:tc>
-          <w:tcPr>
-            <w:tcW w:type="dxa" w:w="1520"/>
-          </w:tcPr>
-          <w:p/>
-        </w:tc>
-        <w:tc>
-          <w:tcPr>
-            <w:tcW w:type="dxa" w:w="1520"/>
-          </w:tcPr>
-          <w:p/>
-        </w:tc>
-        <w:tc>
-          <w:tcPr>
-            <w:tcW w:type="dxa" w:w="1520"/>
-          </w:tcPr>
-          <w:p/>
-        </w:tc>
-        <w:tc>
-          <w:tcPr>
-            <w:tcW w:type="dxa" w:w="1520"/>
-          </w:tcPr>
-          <w:p/>
-        </w:tc>
-        <w:tc>
-          <w:tcPr>
-            <w:tcW w:type="dxa" w:w="1520"/>
-          </w:tcPr>
-          <w:p/>
         </w:tc>
         <w:tc>
           <w:tcPr>
@@ -1174,44 +984,6 @@
           <w:tcPr>
             <w:tcW w:type="dxa" w:w="1520"/>
           </w:tcPr>
-          <w:p/>
-        </w:tc>
-        <w:tc>
-          <w:tcPr>
-            <w:tcW w:type="dxa" w:w="1520"/>
-          </w:tcPr>
-          <w:p/>
-        </w:tc>
-        <w:tc>
-          <w:tcPr>
-            <w:tcW w:type="dxa" w:w="1520"/>
-          </w:tcPr>
-          <w:p/>
-        </w:tc>
-        <w:tc>
-          <w:tcPr>
-            <w:tcW w:type="dxa" w:w="1520"/>
-          </w:tcPr>
-          <w:p/>
-        </w:tc>
-        <w:tc>
-          <w:tcPr>
-            <w:tcW w:type="dxa" w:w="1520"/>
-          </w:tcPr>
-          <w:p/>
-        </w:tc>
-      </w:tr>
-      <w:tr>
-        <w:tc>
-          <w:tcPr>
-            <w:tcW w:type="dxa" w:w="1520"/>
-          </w:tcPr>
-          <w:p/>
-        </w:tc>
-        <w:tc>
-          <w:tcPr>
-            <w:tcW w:type="dxa" w:w="1520"/>
-          </w:tcPr>
           <w:p>
             <w:pPr>
               <w:jc w:val="center"/>
@@ -1226,44 +998,6 @@
               <w:t>~2.03</w:t>
             </w:r>
           </w:p>
-        </w:tc>
-        <w:tc>
-          <w:tcPr>
-            <w:tcW w:type="dxa" w:w="1520"/>
-          </w:tcPr>
-          <w:p/>
-        </w:tc>
-        <w:tc>
-          <w:tcPr>
-            <w:tcW w:type="dxa" w:w="1520"/>
-          </w:tcPr>
-          <w:p/>
-        </w:tc>
-        <w:tc>
-          <w:tcPr>
-            <w:tcW w:type="dxa" w:w="1520"/>
-          </w:tcPr>
-          <w:p/>
-        </w:tc>
-        <w:tc>
-          <w:tcPr>
-            <w:tcW w:type="dxa" w:w="1520"/>
-          </w:tcPr>
-          <w:p/>
-        </w:tc>
-      </w:tr>
-      <w:tr>
-        <w:tc>
-          <w:tcPr>
-            <w:tcW w:type="dxa" w:w="1520"/>
-          </w:tcPr>
-          <w:p/>
-        </w:tc>
-        <w:tc>
-          <w:tcPr>
-            <w:tcW w:type="dxa" w:w="1520"/>
-          </w:tcPr>
-          <w:p/>
         </w:tc>
         <w:tc>
           <w:tcPr>
@@ -1288,39 +1022,20 @@
           <w:tcPr>
             <w:tcW w:type="dxa" w:w="1520"/>
           </w:tcPr>
-          <w:p/>
-        </w:tc>
-        <w:tc>
-          <w:tcPr>
-            <w:tcW w:type="dxa" w:w="1520"/>
-          </w:tcPr>
-          <w:p/>
-        </w:tc>
-        <w:tc>
-          <w:tcPr>
-            <w:tcW w:type="dxa" w:w="1520"/>
-          </w:tcPr>
-          <w:p/>
-        </w:tc>
-      </w:tr>
-      <w:tr>
-        <w:tc>
-          <w:tcPr>
-            <w:tcW w:type="dxa" w:w="1520"/>
-          </w:tcPr>
-          <w:p/>
-        </w:tc>
-        <w:tc>
-          <w:tcPr>
-            <w:tcW w:type="dxa" w:w="1520"/>
-          </w:tcPr>
-          <w:p/>
-        </w:tc>
-        <w:tc>
-          <w:tcPr>
-            <w:tcW w:type="dxa" w:w="1520"/>
-          </w:tcPr>
-          <w:p/>
+          <w:p>
+            <w:pPr>
+              <w:jc w:val="center"/>
+            </w:pPr>
+            <w:r/>
+            <w:r>
+              <w:rPr>
+                <w:rFonts w:ascii="Times New Roman" w:hAnsi="Times New Roman" w:eastAsia="宋体"/>
+                <w:b w:val="0"/>
+                <w:sz w:val="21"/>
+              </w:rPr>
+              <w:t>—</w:t>
+            </w:r>
+          </w:p>
         </w:tc>
         <w:tc>
           <w:tcPr>
@@ -1340,101 +1055,6 @@
               <w:t>—</w:t>
             </w:r>
           </w:p>
-        </w:tc>
-        <w:tc>
-          <w:tcPr>
-            <w:tcW w:type="dxa" w:w="1520"/>
-          </w:tcPr>
-          <w:p/>
-        </w:tc>
-        <w:tc>
-          <w:tcPr>
-            <w:tcW w:type="dxa" w:w="1520"/>
-          </w:tcPr>
-          <w:p/>
-        </w:tc>
-      </w:tr>
-      <w:tr>
-        <w:tc>
-          <w:tcPr>
-            <w:tcW w:type="dxa" w:w="1520"/>
-          </w:tcPr>
-          <w:p/>
-        </w:tc>
-        <w:tc>
-          <w:tcPr>
-            <w:tcW w:type="dxa" w:w="1520"/>
-          </w:tcPr>
-          <w:p/>
-        </w:tc>
-        <w:tc>
-          <w:tcPr>
-            <w:tcW w:type="dxa" w:w="1520"/>
-          </w:tcPr>
-          <w:p/>
-        </w:tc>
-        <w:tc>
-          <w:tcPr>
-            <w:tcW w:type="dxa" w:w="1520"/>
-          </w:tcPr>
-          <w:p/>
-        </w:tc>
-        <w:tc>
-          <w:tcPr>
-            <w:tcW w:type="dxa" w:w="1520"/>
-          </w:tcPr>
-          <w:p>
-            <w:pPr>
-              <w:jc w:val="center"/>
-            </w:pPr>
-            <w:r/>
-            <w:r>
-              <w:rPr>
-                <w:rFonts w:ascii="Times New Roman" w:hAnsi="Times New Roman" w:eastAsia="宋体"/>
-                <w:b w:val="0"/>
-                <w:sz w:val="21"/>
-              </w:rPr>
-              <w:t>—</w:t>
-            </w:r>
-          </w:p>
-        </w:tc>
-        <w:tc>
-          <w:tcPr>
-            <w:tcW w:type="dxa" w:w="1520"/>
-          </w:tcPr>
-          <w:p/>
-        </w:tc>
-      </w:tr>
-      <w:tr>
-        <w:tc>
-          <w:tcPr>
-            <w:tcW w:type="dxa" w:w="1520"/>
-          </w:tcPr>
-          <w:p/>
-        </w:tc>
-        <w:tc>
-          <w:tcPr>
-            <w:tcW w:type="dxa" w:w="1520"/>
-          </w:tcPr>
-          <w:p/>
-        </w:tc>
-        <w:tc>
-          <w:tcPr>
-            <w:tcW w:type="dxa" w:w="1520"/>
-          </w:tcPr>
-          <w:p/>
-        </w:tc>
-        <w:tc>
-          <w:tcPr>
-            <w:tcW w:type="dxa" w:w="1520"/>
-          </w:tcPr>
-          <w:p/>
-        </w:tc>
-        <w:tc>
-          <w:tcPr>
-            <w:tcW w:type="dxa" w:w="1520"/>
-          </w:tcPr>
-          <w:p/>
         </w:tc>
         <w:tc>
           <w:tcPr>
@@ -1479,44 +1099,6 @@
           <w:tcPr>
             <w:tcW w:type="dxa" w:w="1520"/>
           </w:tcPr>
-          <w:p/>
-        </w:tc>
-        <w:tc>
-          <w:tcPr>
-            <w:tcW w:type="dxa" w:w="1520"/>
-          </w:tcPr>
-          <w:p/>
-        </w:tc>
-        <w:tc>
-          <w:tcPr>
-            <w:tcW w:type="dxa" w:w="1520"/>
-          </w:tcPr>
-          <w:p/>
-        </w:tc>
-        <w:tc>
-          <w:tcPr>
-            <w:tcW w:type="dxa" w:w="1520"/>
-          </w:tcPr>
-          <w:p/>
-        </w:tc>
-        <w:tc>
-          <w:tcPr>
-            <w:tcW w:type="dxa" w:w="1520"/>
-          </w:tcPr>
-          <w:p/>
-        </w:tc>
-      </w:tr>
-      <w:tr>
-        <w:tc>
-          <w:tcPr>
-            <w:tcW w:type="dxa" w:w="1520"/>
-          </w:tcPr>
-          <w:p/>
-        </w:tc>
-        <w:tc>
-          <w:tcPr>
-            <w:tcW w:type="dxa" w:w="1520"/>
-          </w:tcPr>
           <w:p>
             <w:pPr>
               <w:jc w:val="center"/>
@@ -1531,44 +1113,6 @@
               <w:t>~2.1</w:t>
             </w:r>
           </w:p>
-        </w:tc>
-        <w:tc>
-          <w:tcPr>
-            <w:tcW w:type="dxa" w:w="1520"/>
-          </w:tcPr>
-          <w:p/>
-        </w:tc>
-        <w:tc>
-          <w:tcPr>
-            <w:tcW w:type="dxa" w:w="1520"/>
-          </w:tcPr>
-          <w:p/>
-        </w:tc>
-        <w:tc>
-          <w:tcPr>
-            <w:tcW w:type="dxa" w:w="1520"/>
-          </w:tcPr>
-          <w:p/>
-        </w:tc>
-        <w:tc>
-          <w:tcPr>
-            <w:tcW w:type="dxa" w:w="1520"/>
-          </w:tcPr>
-          <w:p/>
-        </w:tc>
-      </w:tr>
-      <w:tr>
-        <w:tc>
-          <w:tcPr>
-            <w:tcW w:type="dxa" w:w="1520"/>
-          </w:tcPr>
-          <w:p/>
-        </w:tc>
-        <w:tc>
-          <w:tcPr>
-            <w:tcW w:type="dxa" w:w="1520"/>
-          </w:tcPr>
-          <w:p/>
         </w:tc>
         <w:tc>
           <w:tcPr>
@@ -1593,39 +1137,20 @@
           <w:tcPr>
             <w:tcW w:type="dxa" w:w="1520"/>
           </w:tcPr>
-          <w:p/>
-        </w:tc>
-        <w:tc>
-          <w:tcPr>
-            <w:tcW w:type="dxa" w:w="1520"/>
-          </w:tcPr>
-          <w:p/>
-        </w:tc>
-        <w:tc>
-          <w:tcPr>
-            <w:tcW w:type="dxa" w:w="1520"/>
-          </w:tcPr>
-          <w:p/>
-        </w:tc>
-      </w:tr>
-      <w:tr>
-        <w:tc>
-          <w:tcPr>
-            <w:tcW w:type="dxa" w:w="1520"/>
-          </w:tcPr>
-          <w:p/>
-        </w:tc>
-        <w:tc>
-          <w:tcPr>
-            <w:tcW w:type="dxa" w:w="1520"/>
-          </w:tcPr>
-          <w:p/>
-        </w:tc>
-        <w:tc>
-          <w:tcPr>
-            <w:tcW w:type="dxa" w:w="1520"/>
-          </w:tcPr>
-          <w:p/>
+          <w:p>
+            <w:pPr>
+              <w:jc w:val="center"/>
+            </w:pPr>
+            <w:r/>
+            <w:r>
+              <w:rPr>
+                <w:rFonts w:ascii="Times New Roman" w:hAnsi="Times New Roman" w:eastAsia="宋体"/>
+                <w:b w:val="0"/>
+                <w:sz w:val="21"/>
+              </w:rPr>
+              <w:t>—</w:t>
+            </w:r>
+          </w:p>
         </w:tc>
         <w:tc>
           <w:tcPr>
@@ -1645,101 +1170,6 @@
               <w:t>—</w:t>
             </w:r>
           </w:p>
-        </w:tc>
-        <w:tc>
-          <w:tcPr>
-            <w:tcW w:type="dxa" w:w="1520"/>
-          </w:tcPr>
-          <w:p/>
-        </w:tc>
-        <w:tc>
-          <w:tcPr>
-            <w:tcW w:type="dxa" w:w="1520"/>
-          </w:tcPr>
-          <w:p/>
-        </w:tc>
-      </w:tr>
-      <w:tr>
-        <w:tc>
-          <w:tcPr>
-            <w:tcW w:type="dxa" w:w="1520"/>
-          </w:tcPr>
-          <w:p/>
-        </w:tc>
-        <w:tc>
-          <w:tcPr>
-            <w:tcW w:type="dxa" w:w="1520"/>
-          </w:tcPr>
-          <w:p/>
-        </w:tc>
-        <w:tc>
-          <w:tcPr>
-            <w:tcW w:type="dxa" w:w="1520"/>
-          </w:tcPr>
-          <w:p/>
-        </w:tc>
-        <w:tc>
-          <w:tcPr>
-            <w:tcW w:type="dxa" w:w="1520"/>
-          </w:tcPr>
-          <w:p/>
-        </w:tc>
-        <w:tc>
-          <w:tcPr>
-            <w:tcW w:type="dxa" w:w="1520"/>
-          </w:tcPr>
-          <w:p>
-            <w:pPr>
-              <w:jc w:val="center"/>
-            </w:pPr>
-            <w:r/>
-            <w:r>
-              <w:rPr>
-                <w:rFonts w:ascii="Times New Roman" w:hAnsi="Times New Roman" w:eastAsia="宋体"/>
-                <w:b w:val="0"/>
-                <w:sz w:val="21"/>
-              </w:rPr>
-              <w:t>—</w:t>
-            </w:r>
-          </w:p>
-        </w:tc>
-        <w:tc>
-          <w:tcPr>
-            <w:tcW w:type="dxa" w:w="1520"/>
-          </w:tcPr>
-          <w:p/>
-        </w:tc>
-      </w:tr>
-      <w:tr>
-        <w:tc>
-          <w:tcPr>
-            <w:tcW w:type="dxa" w:w="1520"/>
-          </w:tcPr>
-          <w:p/>
-        </w:tc>
-        <w:tc>
-          <w:tcPr>
-            <w:tcW w:type="dxa" w:w="1520"/>
-          </w:tcPr>
-          <w:p/>
-        </w:tc>
-        <w:tc>
-          <w:tcPr>
-            <w:tcW w:type="dxa" w:w="1520"/>
-          </w:tcPr>
-          <w:p/>
-        </w:tc>
-        <w:tc>
-          <w:tcPr>
-            <w:tcW w:type="dxa" w:w="1520"/>
-          </w:tcPr>
-          <w:p/>
-        </w:tc>
-        <w:tc>
-          <w:tcPr>
-            <w:tcW w:type="dxa" w:w="1520"/>
-          </w:tcPr>
-          <w:p/>
         </w:tc>
         <w:tc>
           <w:tcPr>
@@ -1785,44 +1215,6 @@
           <w:tcPr>
             <w:tcW w:type="dxa" w:w="1520"/>
           </w:tcPr>
-          <w:p/>
-        </w:tc>
-        <w:tc>
-          <w:tcPr>
-            <w:tcW w:type="dxa" w:w="1520"/>
-          </w:tcPr>
-          <w:p/>
-        </w:tc>
-        <w:tc>
-          <w:tcPr>
-            <w:tcW w:type="dxa" w:w="1520"/>
-          </w:tcPr>
-          <w:p/>
-        </w:tc>
-        <w:tc>
-          <w:tcPr>
-            <w:tcW w:type="dxa" w:w="1520"/>
-          </w:tcPr>
-          <w:p/>
-        </w:tc>
-        <w:tc>
-          <w:tcPr>
-            <w:tcW w:type="dxa" w:w="1520"/>
-          </w:tcPr>
-          <w:p/>
-        </w:tc>
-      </w:tr>
-      <w:tr>
-        <w:tc>
-          <w:tcPr>
-            <w:tcW w:type="dxa" w:w="1520"/>
-          </w:tcPr>
-          <w:p/>
-        </w:tc>
-        <w:tc>
-          <w:tcPr>
-            <w:tcW w:type="dxa" w:w="1520"/>
-          </w:tcPr>
           <w:p>
             <w:pPr>
               <w:jc w:val="center"/>
@@ -1837,44 +1229,6 @@
               <w:t>2.030</w:t>
             </w:r>
           </w:p>
-        </w:tc>
-        <w:tc>
-          <w:tcPr>
-            <w:tcW w:type="dxa" w:w="1520"/>
-          </w:tcPr>
-          <w:p/>
-        </w:tc>
-        <w:tc>
-          <w:tcPr>
-            <w:tcW w:type="dxa" w:w="1520"/>
-          </w:tcPr>
-          <w:p/>
-        </w:tc>
-        <w:tc>
-          <w:tcPr>
-            <w:tcW w:type="dxa" w:w="1520"/>
-          </w:tcPr>
-          <w:p/>
-        </w:tc>
-        <w:tc>
-          <w:tcPr>
-            <w:tcW w:type="dxa" w:w="1520"/>
-          </w:tcPr>
-          <w:p/>
-        </w:tc>
-      </w:tr>
-      <w:tr>
-        <w:tc>
-          <w:tcPr>
-            <w:tcW w:type="dxa" w:w="1520"/>
-          </w:tcPr>
-          <w:p/>
-        </w:tc>
-        <w:tc>
-          <w:tcPr>
-            <w:tcW w:type="dxa" w:w="1520"/>
-          </w:tcPr>
-          <w:p/>
         </w:tc>
         <w:tc>
           <w:tcPr>
@@ -1899,44 +1253,6 @@
           <w:tcPr>
             <w:tcW w:type="dxa" w:w="1520"/>
           </w:tcPr>
-          <w:p/>
-        </w:tc>
-        <w:tc>
-          <w:tcPr>
-            <w:tcW w:type="dxa" w:w="1520"/>
-          </w:tcPr>
-          <w:p/>
-        </w:tc>
-        <w:tc>
-          <w:tcPr>
-            <w:tcW w:type="dxa" w:w="1520"/>
-          </w:tcPr>
-          <w:p/>
-        </w:tc>
-      </w:tr>
-      <w:tr>
-        <w:tc>
-          <w:tcPr>
-            <w:tcW w:type="dxa" w:w="1520"/>
-          </w:tcPr>
-          <w:p/>
-        </w:tc>
-        <w:tc>
-          <w:tcPr>
-            <w:tcW w:type="dxa" w:w="1520"/>
-          </w:tcPr>
-          <w:p/>
-        </w:tc>
-        <w:tc>
-          <w:tcPr>
-            <w:tcW w:type="dxa" w:w="1520"/>
-          </w:tcPr>
-          <w:p/>
-        </w:tc>
-        <w:tc>
-          <w:tcPr>
-            <w:tcW w:type="dxa" w:w="1520"/>
-          </w:tcPr>
           <w:p>
             <w:pPr>
               <w:jc w:val="center"/>
@@ -1956,44 +1272,6 @@
           <w:tcPr>
             <w:tcW w:type="dxa" w:w="1520"/>
           </w:tcPr>
-          <w:p/>
-        </w:tc>
-        <w:tc>
-          <w:tcPr>
-            <w:tcW w:type="dxa" w:w="1520"/>
-          </w:tcPr>
-          <w:p/>
-        </w:tc>
-      </w:tr>
-      <w:tr>
-        <w:tc>
-          <w:tcPr>
-            <w:tcW w:type="dxa" w:w="1520"/>
-          </w:tcPr>
-          <w:p/>
-        </w:tc>
-        <w:tc>
-          <w:tcPr>
-            <w:tcW w:type="dxa" w:w="1520"/>
-          </w:tcPr>
-          <w:p/>
-        </w:tc>
-        <w:tc>
-          <w:tcPr>
-            <w:tcW w:type="dxa" w:w="1520"/>
-          </w:tcPr>
-          <w:p/>
-        </w:tc>
-        <w:tc>
-          <w:tcPr>
-            <w:tcW w:type="dxa" w:w="1520"/>
-          </w:tcPr>
-          <w:p/>
-        </w:tc>
-        <w:tc>
-          <w:tcPr>
-            <w:tcW w:type="dxa" w:w="1520"/>
-          </w:tcPr>
           <w:p>
             <w:pPr>
               <w:jc w:val="center"/>
@@ -2008,44 +1286,6 @@
               <w:t>0.321</w:t>
             </w:r>
           </w:p>
-        </w:tc>
-        <w:tc>
-          <w:tcPr>
-            <w:tcW w:type="dxa" w:w="1520"/>
-          </w:tcPr>
-          <w:p/>
-        </w:tc>
-      </w:tr>
-      <w:tr>
-        <w:tc>
-          <w:tcPr>
-            <w:tcW w:type="dxa" w:w="1520"/>
-          </w:tcPr>
-          <w:p/>
-        </w:tc>
-        <w:tc>
-          <w:tcPr>
-            <w:tcW w:type="dxa" w:w="1520"/>
-          </w:tcPr>
-          <w:p/>
-        </w:tc>
-        <w:tc>
-          <w:tcPr>
-            <w:tcW w:type="dxa" w:w="1520"/>
-          </w:tcPr>
-          <w:p/>
-        </w:tc>
-        <w:tc>
-          <w:tcPr>
-            <w:tcW w:type="dxa" w:w="1520"/>
-          </w:tcPr>
-          <w:p/>
-        </w:tc>
-        <w:tc>
-          <w:tcPr>
-            <w:tcW w:type="dxa" w:w="1520"/>
-          </w:tcPr>
-          <w:p/>
         </w:tc>
         <w:tc>
           <w:tcPr>
@@ -2091,44 +1331,6 @@
           <w:tcPr>
             <w:tcW w:type="dxa" w:w="1520"/>
           </w:tcPr>
-          <w:p/>
-        </w:tc>
-        <w:tc>
-          <w:tcPr>
-            <w:tcW w:type="dxa" w:w="1520"/>
-          </w:tcPr>
-          <w:p/>
-        </w:tc>
-        <w:tc>
-          <w:tcPr>
-            <w:tcW w:type="dxa" w:w="1520"/>
-          </w:tcPr>
-          <w:p/>
-        </w:tc>
-        <w:tc>
-          <w:tcPr>
-            <w:tcW w:type="dxa" w:w="1520"/>
-          </w:tcPr>
-          <w:p/>
-        </w:tc>
-        <w:tc>
-          <w:tcPr>
-            <w:tcW w:type="dxa" w:w="1520"/>
-          </w:tcPr>
-          <w:p/>
-        </w:tc>
-      </w:tr>
-      <w:tr>
-        <w:tc>
-          <w:tcPr>
-            <w:tcW w:type="dxa" w:w="1520"/>
-          </w:tcPr>
-          <w:p/>
-        </w:tc>
-        <w:tc>
-          <w:tcPr>
-            <w:tcW w:type="dxa" w:w="1520"/>
-          </w:tcPr>
           <w:p>
             <w:pPr>
               <w:jc w:val="center"/>
@@ -2143,44 +1345,6 @@
               <w:t>2.094</w:t>
             </w:r>
           </w:p>
-        </w:tc>
-        <w:tc>
-          <w:tcPr>
-            <w:tcW w:type="dxa" w:w="1520"/>
-          </w:tcPr>
-          <w:p/>
-        </w:tc>
-        <w:tc>
-          <w:tcPr>
-            <w:tcW w:type="dxa" w:w="1520"/>
-          </w:tcPr>
-          <w:p/>
-        </w:tc>
-        <w:tc>
-          <w:tcPr>
-            <w:tcW w:type="dxa" w:w="1520"/>
-          </w:tcPr>
-          <w:p/>
-        </w:tc>
-        <w:tc>
-          <w:tcPr>
-            <w:tcW w:type="dxa" w:w="1520"/>
-          </w:tcPr>
-          <w:p/>
-        </w:tc>
-      </w:tr>
-      <w:tr>
-        <w:tc>
-          <w:tcPr>
-            <w:tcW w:type="dxa" w:w="1520"/>
-          </w:tcPr>
-          <w:p/>
-        </w:tc>
-        <w:tc>
-          <w:tcPr>
-            <w:tcW w:type="dxa" w:w="1520"/>
-          </w:tcPr>
-          <w:p/>
         </w:tc>
         <w:tc>
           <w:tcPr>
@@ -2205,44 +1369,6 @@
           <w:tcPr>
             <w:tcW w:type="dxa" w:w="1520"/>
           </w:tcPr>
-          <w:p/>
-        </w:tc>
-        <w:tc>
-          <w:tcPr>
-            <w:tcW w:type="dxa" w:w="1520"/>
-          </w:tcPr>
-          <w:p/>
-        </w:tc>
-        <w:tc>
-          <w:tcPr>
-            <w:tcW w:type="dxa" w:w="1520"/>
-          </w:tcPr>
-          <w:p/>
-        </w:tc>
-      </w:tr>
-      <w:tr>
-        <w:tc>
-          <w:tcPr>
-            <w:tcW w:type="dxa" w:w="1520"/>
-          </w:tcPr>
-          <w:p/>
-        </w:tc>
-        <w:tc>
-          <w:tcPr>
-            <w:tcW w:type="dxa" w:w="1520"/>
-          </w:tcPr>
-          <w:p/>
-        </w:tc>
-        <w:tc>
-          <w:tcPr>
-            <w:tcW w:type="dxa" w:w="1520"/>
-          </w:tcPr>
-          <w:p/>
-        </w:tc>
-        <w:tc>
-          <w:tcPr>
-            <w:tcW w:type="dxa" w:w="1520"/>
-          </w:tcPr>
           <w:p>
             <w:pPr>
               <w:jc w:val="center"/>
@@ -2262,44 +1388,6 @@
           <w:tcPr>
             <w:tcW w:type="dxa" w:w="1520"/>
           </w:tcPr>
-          <w:p/>
-        </w:tc>
-        <w:tc>
-          <w:tcPr>
-            <w:tcW w:type="dxa" w:w="1520"/>
-          </w:tcPr>
-          <w:p/>
-        </w:tc>
-      </w:tr>
-      <w:tr>
-        <w:tc>
-          <w:tcPr>
-            <w:tcW w:type="dxa" w:w="1520"/>
-          </w:tcPr>
-          <w:p/>
-        </w:tc>
-        <w:tc>
-          <w:tcPr>
-            <w:tcW w:type="dxa" w:w="1520"/>
-          </w:tcPr>
-          <w:p/>
-        </w:tc>
-        <w:tc>
-          <w:tcPr>
-            <w:tcW w:type="dxa" w:w="1520"/>
-          </w:tcPr>
-          <w:p/>
-        </w:tc>
-        <w:tc>
-          <w:tcPr>
-            <w:tcW w:type="dxa" w:w="1520"/>
-          </w:tcPr>
-          <w:p/>
-        </w:tc>
-        <w:tc>
-          <w:tcPr>
-            <w:tcW w:type="dxa" w:w="1520"/>
-          </w:tcPr>
           <w:p>
             <w:pPr>
               <w:jc w:val="center"/>
@@ -2314,44 +1402,6 @@
               <w:t>0.318</w:t>
             </w:r>
           </w:p>
-        </w:tc>
-        <w:tc>
-          <w:tcPr>
-            <w:tcW w:type="dxa" w:w="1520"/>
-          </w:tcPr>
-          <w:p/>
-        </w:tc>
-      </w:tr>
-      <w:tr>
-        <w:tc>
-          <w:tcPr>
-            <w:tcW w:type="dxa" w:w="1520"/>
-          </w:tcPr>
-          <w:p/>
-        </w:tc>
-        <w:tc>
-          <w:tcPr>
-            <w:tcW w:type="dxa" w:w="1520"/>
-          </w:tcPr>
-          <w:p/>
-        </w:tc>
-        <w:tc>
-          <w:tcPr>
-            <w:tcW w:type="dxa" w:w="1520"/>
-          </w:tcPr>
-          <w:p/>
-        </w:tc>
-        <w:tc>
-          <w:tcPr>
-            <w:tcW w:type="dxa" w:w="1520"/>
-          </w:tcPr>
-          <w:p/>
-        </w:tc>
-        <w:tc>
-          <w:tcPr>
-            <w:tcW w:type="dxa" w:w="1520"/>
-          </w:tcPr>
-          <w:p/>
         </w:tc>
         <w:tc>
           <w:tcPr>
@@ -2397,44 +1447,6 @@
           <w:tcPr>
             <w:tcW w:type="dxa" w:w="1520"/>
           </w:tcPr>
-          <w:p/>
-        </w:tc>
-        <w:tc>
-          <w:tcPr>
-            <w:tcW w:type="dxa" w:w="1520"/>
-          </w:tcPr>
-          <w:p/>
-        </w:tc>
-        <w:tc>
-          <w:tcPr>
-            <w:tcW w:type="dxa" w:w="1520"/>
-          </w:tcPr>
-          <w:p/>
-        </w:tc>
-        <w:tc>
-          <w:tcPr>
-            <w:tcW w:type="dxa" w:w="1520"/>
-          </w:tcPr>
-          <w:p/>
-        </w:tc>
-        <w:tc>
-          <w:tcPr>
-            <w:tcW w:type="dxa" w:w="1520"/>
-          </w:tcPr>
-          <w:p/>
-        </w:tc>
-      </w:tr>
-      <w:tr>
-        <w:tc>
-          <w:tcPr>
-            <w:tcW w:type="dxa" w:w="1520"/>
-          </w:tcPr>
-          <w:p/>
-        </w:tc>
-        <w:tc>
-          <w:tcPr>
-            <w:tcW w:type="dxa" w:w="1520"/>
-          </w:tcPr>
           <w:p>
             <w:pPr>
               <w:jc w:val="center"/>
@@ -2449,44 +1461,6 @@
               <w:t>2.162</w:t>
             </w:r>
           </w:p>
-        </w:tc>
-        <w:tc>
-          <w:tcPr>
-            <w:tcW w:type="dxa" w:w="1520"/>
-          </w:tcPr>
-          <w:p/>
-        </w:tc>
-        <w:tc>
-          <w:tcPr>
-            <w:tcW w:type="dxa" w:w="1520"/>
-          </w:tcPr>
-          <w:p/>
-        </w:tc>
-        <w:tc>
-          <w:tcPr>
-            <w:tcW w:type="dxa" w:w="1520"/>
-          </w:tcPr>
-          <w:p/>
-        </w:tc>
-        <w:tc>
-          <w:tcPr>
-            <w:tcW w:type="dxa" w:w="1520"/>
-          </w:tcPr>
-          <w:p/>
-        </w:tc>
-      </w:tr>
-      <w:tr>
-        <w:tc>
-          <w:tcPr>
-            <w:tcW w:type="dxa" w:w="1520"/>
-          </w:tcPr>
-          <w:p/>
-        </w:tc>
-        <w:tc>
-          <w:tcPr>
-            <w:tcW w:type="dxa" w:w="1520"/>
-          </w:tcPr>
-          <w:p/>
         </w:tc>
         <w:tc>
           <w:tcPr>
@@ -2511,44 +1485,6 @@
           <w:tcPr>
             <w:tcW w:type="dxa" w:w="1520"/>
           </w:tcPr>
-          <w:p/>
-        </w:tc>
-        <w:tc>
-          <w:tcPr>
-            <w:tcW w:type="dxa" w:w="1520"/>
-          </w:tcPr>
-          <w:p/>
-        </w:tc>
-        <w:tc>
-          <w:tcPr>
-            <w:tcW w:type="dxa" w:w="1520"/>
-          </w:tcPr>
-          <w:p/>
-        </w:tc>
-      </w:tr>
-      <w:tr>
-        <w:tc>
-          <w:tcPr>
-            <w:tcW w:type="dxa" w:w="1520"/>
-          </w:tcPr>
-          <w:p/>
-        </w:tc>
-        <w:tc>
-          <w:tcPr>
-            <w:tcW w:type="dxa" w:w="1520"/>
-          </w:tcPr>
-          <w:p/>
-        </w:tc>
-        <w:tc>
-          <w:tcPr>
-            <w:tcW w:type="dxa" w:w="1520"/>
-          </w:tcPr>
-          <w:p/>
-        </w:tc>
-        <w:tc>
-          <w:tcPr>
-            <w:tcW w:type="dxa" w:w="1520"/>
-          </w:tcPr>
           <w:p>
             <w:pPr>
               <w:jc w:val="center"/>
@@ -2568,44 +1504,6 @@
           <w:tcPr>
             <w:tcW w:type="dxa" w:w="1520"/>
           </w:tcPr>
-          <w:p/>
-        </w:tc>
-        <w:tc>
-          <w:tcPr>
-            <w:tcW w:type="dxa" w:w="1520"/>
-          </w:tcPr>
-          <w:p/>
-        </w:tc>
-      </w:tr>
-      <w:tr>
-        <w:tc>
-          <w:tcPr>
-            <w:tcW w:type="dxa" w:w="1520"/>
-          </w:tcPr>
-          <w:p/>
-        </w:tc>
-        <w:tc>
-          <w:tcPr>
-            <w:tcW w:type="dxa" w:w="1520"/>
-          </w:tcPr>
-          <w:p/>
-        </w:tc>
-        <w:tc>
-          <w:tcPr>
-            <w:tcW w:type="dxa" w:w="1520"/>
-          </w:tcPr>
-          <w:p/>
-        </w:tc>
-        <w:tc>
-          <w:tcPr>
-            <w:tcW w:type="dxa" w:w="1520"/>
-          </w:tcPr>
-          <w:p/>
-        </w:tc>
-        <w:tc>
-          <w:tcPr>
-            <w:tcW w:type="dxa" w:w="1520"/>
-          </w:tcPr>
           <w:p>
             <w:pPr>
               <w:jc w:val="center"/>
@@ -2620,44 +1518,6 @@
               <w:t>0.325</w:t>
             </w:r>
           </w:p>
-        </w:tc>
-        <w:tc>
-          <w:tcPr>
-            <w:tcW w:type="dxa" w:w="1520"/>
-          </w:tcPr>
-          <w:p/>
-        </w:tc>
-      </w:tr>
-      <w:tr>
-        <w:tc>
-          <w:tcPr>
-            <w:tcW w:type="dxa" w:w="1520"/>
-          </w:tcPr>
-          <w:p/>
-        </w:tc>
-        <w:tc>
-          <w:tcPr>
-            <w:tcW w:type="dxa" w:w="1520"/>
-          </w:tcPr>
-          <w:p/>
-        </w:tc>
-        <w:tc>
-          <w:tcPr>
-            <w:tcW w:type="dxa" w:w="1520"/>
-          </w:tcPr>
-          <w:p/>
-        </w:tc>
-        <w:tc>
-          <w:tcPr>
-            <w:tcW w:type="dxa" w:w="1520"/>
-          </w:tcPr>
-          <w:p/>
-        </w:tc>
-        <w:tc>
-          <w:tcPr>
-            <w:tcW w:type="dxa" w:w="1520"/>
-          </w:tcPr>
-          <w:p/>
         </w:tc>
         <w:tc>
           <w:tcPr>
@@ -2974,32 +1834,6 @@
           <w:tcPr>
             <w:tcW w:type="dxa" w:w="2280"/>
           </w:tcPr>
-          <w:p/>
-        </w:tc>
-        <w:tc>
-          <w:tcPr>
-            <w:tcW w:type="dxa" w:w="2280"/>
-          </w:tcPr>
-          <w:p/>
-        </w:tc>
-        <w:tc>
-          <w:tcPr>
-            <w:tcW w:type="dxa" w:w="2280"/>
-          </w:tcPr>
-          <w:p/>
-        </w:tc>
-      </w:tr>
-      <w:tr>
-        <w:tc>
-          <w:tcPr>
-            <w:tcW w:type="dxa" w:w="2280"/>
-          </w:tcPr>
-          <w:p/>
-        </w:tc>
-        <w:tc>
-          <w:tcPr>
-            <w:tcW w:type="dxa" w:w="2280"/>
-          </w:tcPr>
           <w:p>
             <w:pPr>
               <w:jc w:val="center"/>
@@ -3019,32 +1853,6 @@
           <w:tcPr>
             <w:tcW w:type="dxa" w:w="2280"/>
           </w:tcPr>
-          <w:p/>
-        </w:tc>
-        <w:tc>
-          <w:tcPr>
-            <w:tcW w:type="dxa" w:w="2280"/>
-          </w:tcPr>
-          <w:p/>
-        </w:tc>
-      </w:tr>
-      <w:tr>
-        <w:tc>
-          <w:tcPr>
-            <w:tcW w:type="dxa" w:w="2280"/>
-          </w:tcPr>
-          <w:p/>
-        </w:tc>
-        <w:tc>
-          <w:tcPr>
-            <w:tcW w:type="dxa" w:w="2280"/>
-          </w:tcPr>
-          <w:p/>
-        </w:tc>
-        <w:tc>
-          <w:tcPr>
-            <w:tcW w:type="dxa" w:w="2280"/>
-          </w:tcPr>
           <w:p>
             <w:pPr>
               <w:jc w:val="center"/>
@@ -3059,32 +1867,6 @@
               <w:t>0.349</w:t>
             </w:r>
           </w:p>
-        </w:tc>
-        <w:tc>
-          <w:tcPr>
-            <w:tcW w:type="dxa" w:w="2280"/>
-          </w:tcPr>
-          <w:p/>
-        </w:tc>
-      </w:tr>
-      <w:tr>
-        <w:tc>
-          <w:tcPr>
-            <w:tcW w:type="dxa" w:w="2280"/>
-          </w:tcPr>
-          <w:p/>
-        </w:tc>
-        <w:tc>
-          <w:tcPr>
-            <w:tcW w:type="dxa" w:w="2280"/>
-          </w:tcPr>
-          <w:p/>
-        </w:tc>
-        <w:tc>
-          <w:tcPr>
-            <w:tcW w:type="dxa" w:w="2280"/>
-          </w:tcPr>
-          <w:p/>
         </w:tc>
         <w:tc>
           <w:tcPr>
@@ -3130,32 +1912,6 @@
           <w:tcPr>
             <w:tcW w:type="dxa" w:w="2280"/>
           </w:tcPr>
-          <w:p/>
-        </w:tc>
-        <w:tc>
-          <w:tcPr>
-            <w:tcW w:type="dxa" w:w="2280"/>
-          </w:tcPr>
-          <w:p/>
-        </w:tc>
-        <w:tc>
-          <w:tcPr>
-            <w:tcW w:type="dxa" w:w="2280"/>
-          </w:tcPr>
-          <w:p/>
-        </w:tc>
-      </w:tr>
-      <w:tr>
-        <w:tc>
-          <w:tcPr>
-            <w:tcW w:type="dxa" w:w="2280"/>
-          </w:tcPr>
-          <w:p/>
-        </w:tc>
-        <w:tc>
-          <w:tcPr>
-            <w:tcW w:type="dxa" w:w="2280"/>
-          </w:tcPr>
           <w:p>
             <w:pPr>
               <w:jc w:val="center"/>
@@ -3175,32 +1931,6 @@
           <w:tcPr>
             <w:tcW w:type="dxa" w:w="2280"/>
           </w:tcPr>
-          <w:p/>
-        </w:tc>
-        <w:tc>
-          <w:tcPr>
-            <w:tcW w:type="dxa" w:w="2280"/>
-          </w:tcPr>
-          <w:p/>
-        </w:tc>
-      </w:tr>
-      <w:tr>
-        <w:tc>
-          <w:tcPr>
-            <w:tcW w:type="dxa" w:w="2280"/>
-          </w:tcPr>
-          <w:p/>
-        </w:tc>
-        <w:tc>
-          <w:tcPr>
-            <w:tcW w:type="dxa" w:w="2280"/>
-          </w:tcPr>
-          <w:p/>
-        </w:tc>
-        <w:tc>
-          <w:tcPr>
-            <w:tcW w:type="dxa" w:w="2280"/>
-          </w:tcPr>
           <w:p>
             <w:pPr>
               <w:jc w:val="center"/>
@@ -3215,32 +1945,6 @@
               <w:t>0.471</w:t>
             </w:r>
           </w:p>
-        </w:tc>
-        <w:tc>
-          <w:tcPr>
-            <w:tcW w:type="dxa" w:w="2280"/>
-          </w:tcPr>
-          <w:p/>
-        </w:tc>
-      </w:tr>
-      <w:tr>
-        <w:tc>
-          <w:tcPr>
-            <w:tcW w:type="dxa" w:w="2280"/>
-          </w:tcPr>
-          <w:p/>
-        </w:tc>
-        <w:tc>
-          <w:tcPr>
-            <w:tcW w:type="dxa" w:w="2280"/>
-          </w:tcPr>
-          <w:p/>
-        </w:tc>
-        <w:tc>
-          <w:tcPr>
-            <w:tcW w:type="dxa" w:w="2280"/>
-          </w:tcPr>
-          <w:p/>
         </w:tc>
         <w:tc>
           <w:tcPr>
@@ -3286,32 +1990,6 @@
           <w:tcPr>
             <w:tcW w:type="dxa" w:w="2280"/>
           </w:tcPr>
-          <w:p/>
-        </w:tc>
-        <w:tc>
-          <w:tcPr>
-            <w:tcW w:type="dxa" w:w="2280"/>
-          </w:tcPr>
-          <w:p/>
-        </w:tc>
-        <w:tc>
-          <w:tcPr>
-            <w:tcW w:type="dxa" w:w="2280"/>
-          </w:tcPr>
-          <w:p/>
-        </w:tc>
-      </w:tr>
-      <w:tr>
-        <w:tc>
-          <w:tcPr>
-            <w:tcW w:type="dxa" w:w="2280"/>
-          </w:tcPr>
-          <w:p/>
-        </w:tc>
-        <w:tc>
-          <w:tcPr>
-            <w:tcW w:type="dxa" w:w="2280"/>
-          </w:tcPr>
           <w:p>
             <w:pPr>
               <w:jc w:val="center"/>
@@ -3331,32 +2009,6 @@
           <w:tcPr>
             <w:tcW w:type="dxa" w:w="2280"/>
           </w:tcPr>
-          <w:p/>
-        </w:tc>
-        <w:tc>
-          <w:tcPr>
-            <w:tcW w:type="dxa" w:w="2280"/>
-          </w:tcPr>
-          <w:p/>
-        </w:tc>
-      </w:tr>
-      <w:tr>
-        <w:tc>
-          <w:tcPr>
-            <w:tcW w:type="dxa" w:w="2280"/>
-          </w:tcPr>
-          <w:p/>
-        </w:tc>
-        <w:tc>
-          <w:tcPr>
-            <w:tcW w:type="dxa" w:w="2280"/>
-          </w:tcPr>
-          <w:p/>
-        </w:tc>
-        <w:tc>
-          <w:tcPr>
-            <w:tcW w:type="dxa" w:w="2280"/>
-          </w:tcPr>
           <w:p>
             <w:pPr>
               <w:jc w:val="center"/>
@@ -3371,32 +2023,6 @@
               <w:t>↑35%</w:t>
             </w:r>
           </w:p>
-        </w:tc>
-        <w:tc>
-          <w:tcPr>
-            <w:tcW w:type="dxa" w:w="2280"/>
-          </w:tcPr>
-          <w:p/>
-        </w:tc>
-      </w:tr>
-      <w:tr>
-        <w:tc>
-          <w:tcPr>
-            <w:tcW w:type="dxa" w:w="2280"/>
-          </w:tcPr>
-          <w:p/>
-        </w:tc>
-        <w:tc>
-          <w:tcPr>
-            <w:tcW w:type="dxa" w:w="2280"/>
-          </w:tcPr>
-          <w:p/>
-        </w:tc>
-        <w:tc>
-          <w:tcPr>
-            <w:tcW w:type="dxa" w:w="2280"/>
-          </w:tcPr>
-          <w:p/>
         </w:tc>
         <w:tc>
           <w:tcPr>
@@ -3583,7 +2209,7 @@
         </w:rPr>
         <w:t>表3  Monte Carlo Stokes重建误差对比（500样本/温度点×36波长，基于非线性Haller模型评估）</w:t>
         <w:br/>
-        <w:t>注：GA 6meas为单波长优化，全波段评估下CN较高</w:t>
+        <w:t>¹单目标CN优化的GA基线</w:t>
       </w:r>
     </w:p>
     <w:tbl>
@@ -3741,39 +2367,20 @@
           <w:tcPr>
             <w:tcW w:type="dxa" w:w="1520"/>
           </w:tcPr>
-          <w:p/>
-        </w:tc>
-        <w:tc>
-          <w:tcPr>
-            <w:tcW w:type="dxa" w:w="1520"/>
-          </w:tcPr>
-          <w:p/>
-        </w:tc>
-        <w:tc>
-          <w:tcPr>
-            <w:tcW w:type="dxa" w:w="1520"/>
-          </w:tcPr>
-          <w:p/>
-        </w:tc>
-        <w:tc>
-          <w:tcPr>
-            <w:tcW w:type="dxa" w:w="1520"/>
-          </w:tcPr>
-          <w:p/>
-        </w:tc>
-        <w:tc>
-          <w:tcPr>
-            <w:tcW w:type="dxa" w:w="1520"/>
-          </w:tcPr>
-          <w:p/>
-        </w:tc>
-      </w:tr>
-      <w:tr>
-        <w:tc>
-          <w:tcPr>
-            <w:tcW w:type="dxa" w:w="1520"/>
-          </w:tcPr>
-          <w:p/>
+          <w:p>
+            <w:pPr>
+              <w:jc w:val="center"/>
+            </w:pPr>
+            <w:r/>
+            <w:r>
+              <w:rPr>
+                <w:rFonts w:ascii="Times New Roman" w:hAnsi="Times New Roman" w:eastAsia="宋体"/>
+                <w:b w:val="0"/>
+                <w:sz w:val="21"/>
+              </w:rPr>
+              <w:t>2.010</w:t>
+            </w:r>
+          </w:p>
         </w:tc>
         <w:tc>
           <w:tcPr>
@@ -3790,47 +2397,9 @@
                 <w:b w:val="0"/>
                 <w:sz w:val="21"/>
               </w:rPr>
-              <w:t>9.201</w:t>
+              <w:t>0.533</w:t>
             </w:r>
           </w:p>
-        </w:tc>
-        <w:tc>
-          <w:tcPr>
-            <w:tcW w:type="dxa" w:w="1520"/>
-          </w:tcPr>
-          <w:p/>
-        </w:tc>
-        <w:tc>
-          <w:tcPr>
-            <w:tcW w:type="dxa" w:w="1520"/>
-          </w:tcPr>
-          <w:p/>
-        </w:tc>
-        <w:tc>
-          <w:tcPr>
-            <w:tcW w:type="dxa" w:w="1520"/>
-          </w:tcPr>
-          <w:p/>
-        </w:tc>
-        <w:tc>
-          <w:tcPr>
-            <w:tcW w:type="dxa" w:w="1520"/>
-          </w:tcPr>
-          <w:p/>
-        </w:tc>
-      </w:tr>
-      <w:tr>
-        <w:tc>
-          <w:tcPr>
-            <w:tcW w:type="dxa" w:w="1520"/>
-          </w:tcPr>
-          <w:p/>
-        </w:tc>
-        <w:tc>
-          <w:tcPr>
-            <w:tcW w:type="dxa" w:w="1520"/>
-          </w:tcPr>
-          <w:p/>
         </w:tc>
         <w:tc>
           <w:tcPr>
@@ -3847,47 +2416,9 @@
                 <w:b w:val="0"/>
                 <w:sz w:val="21"/>
               </w:rPr>
-              <w:t>10.646</w:t>
+              <w:t>0.099</w:t>
             </w:r>
           </w:p>
-        </w:tc>
-        <w:tc>
-          <w:tcPr>
-            <w:tcW w:type="dxa" w:w="1520"/>
-          </w:tcPr>
-          <w:p/>
-        </w:tc>
-        <w:tc>
-          <w:tcPr>
-            <w:tcW w:type="dxa" w:w="1520"/>
-          </w:tcPr>
-          <w:p/>
-        </w:tc>
-        <w:tc>
-          <w:tcPr>
-            <w:tcW w:type="dxa" w:w="1520"/>
-          </w:tcPr>
-          <w:p/>
-        </w:tc>
-      </w:tr>
-      <w:tr>
-        <w:tc>
-          <w:tcPr>
-            <w:tcW w:type="dxa" w:w="1520"/>
-          </w:tcPr>
-          <w:p/>
-        </w:tc>
-        <w:tc>
-          <w:tcPr>
-            <w:tcW w:type="dxa" w:w="1520"/>
-          </w:tcPr>
-          <w:p/>
-        </w:tc>
-        <w:tc>
-          <w:tcPr>
-            <w:tcW w:type="dxa" w:w="1520"/>
-          </w:tcPr>
-          <w:p/>
         </w:tc>
         <w:tc>
           <w:tcPr>
@@ -3904,47 +2435,9 @@
                 <w:b w:val="0"/>
                 <w:sz w:val="21"/>
               </w:rPr>
-              <w:t>3.293</w:t>
+              <w:t>0.01415</w:t>
             </w:r>
           </w:p>
-        </w:tc>
-        <w:tc>
-          <w:tcPr>
-            <w:tcW w:type="dxa" w:w="1520"/>
-          </w:tcPr>
-          <w:p/>
-        </w:tc>
-        <w:tc>
-          <w:tcPr>
-            <w:tcW w:type="dxa" w:w="1520"/>
-          </w:tcPr>
-          <w:p/>
-        </w:tc>
-      </w:tr>
-      <w:tr>
-        <w:tc>
-          <w:tcPr>
-            <w:tcW w:type="dxa" w:w="1520"/>
-          </w:tcPr>
-          <w:p/>
-        </w:tc>
-        <w:tc>
-          <w:tcPr>
-            <w:tcW w:type="dxa" w:w="1520"/>
-          </w:tcPr>
-          <w:p/>
-        </w:tc>
-        <w:tc>
-          <w:tcPr>
-            <w:tcW w:type="dxa" w:w="1520"/>
-          </w:tcPr>
-          <w:p/>
-        </w:tc>
-        <w:tc>
-          <w:tcPr>
-            <w:tcW w:type="dxa" w:w="1520"/>
-          </w:tcPr>
-          <w:p/>
         </w:tc>
         <w:tc>
           <w:tcPr>
@@ -3961,64 +2454,7 @@
                 <w:b w:val="0"/>
                 <w:sz w:val="21"/>
               </w:rPr>
-              <w:t>0.04379</w:t>
-            </w:r>
-          </w:p>
-        </w:tc>
-        <w:tc>
-          <w:tcPr>
-            <w:tcW w:type="dxa" w:w="1520"/>
-          </w:tcPr>
-          <w:p/>
-        </w:tc>
-      </w:tr>
-      <w:tr>
-        <w:tc>
-          <w:tcPr>
-            <w:tcW w:type="dxa" w:w="1520"/>
-          </w:tcPr>
-          <w:p/>
-        </w:tc>
-        <w:tc>
-          <w:tcPr>
-            <w:tcW w:type="dxa" w:w="1520"/>
-          </w:tcPr>
-          <w:p/>
-        </w:tc>
-        <w:tc>
-          <w:tcPr>
-            <w:tcW w:type="dxa" w:w="1520"/>
-          </w:tcPr>
-          <w:p/>
-        </w:tc>
-        <w:tc>
-          <w:tcPr>
-            <w:tcW w:type="dxa" w:w="1520"/>
-          </w:tcPr>
-          <w:p/>
-        </w:tc>
-        <w:tc>
-          <w:tcPr>
-            <w:tcW w:type="dxa" w:w="1520"/>
-          </w:tcPr>
-          <w:p/>
-        </w:tc>
-        <w:tc>
-          <w:tcPr>
-            <w:tcW w:type="dxa" w:w="1520"/>
-          </w:tcPr>
-          <w:p>
-            <w:pPr>
-              <w:jc w:val="center"/>
-            </w:pPr>
-            <w:r/>
-            <w:r>
-              <w:rPr>
-                <w:rFonts w:ascii="Times New Roman" w:hAnsi="Times New Roman" w:eastAsia="宋体"/>
-                <w:b w:val="0"/>
-                <w:sz w:val="21"/>
-              </w:rPr>
-              <w:t>0.04157</w:t>
+              <w:t>0.01435</w:t>
             </w:r>
           </w:p>
         </w:tc>
@@ -4047,44 +2483,6 @@
           <w:tcPr>
             <w:tcW w:type="dxa" w:w="1520"/>
           </w:tcPr>
-          <w:p/>
-        </w:tc>
-        <w:tc>
-          <w:tcPr>
-            <w:tcW w:type="dxa" w:w="1520"/>
-          </w:tcPr>
-          <w:p/>
-        </w:tc>
-        <w:tc>
-          <w:tcPr>
-            <w:tcW w:type="dxa" w:w="1520"/>
-          </w:tcPr>
-          <w:p/>
-        </w:tc>
-        <w:tc>
-          <w:tcPr>
-            <w:tcW w:type="dxa" w:w="1520"/>
-          </w:tcPr>
-          <w:p/>
-        </w:tc>
-        <w:tc>
-          <w:tcPr>
-            <w:tcW w:type="dxa" w:w="1520"/>
-          </w:tcPr>
-          <w:p/>
-        </w:tc>
-      </w:tr>
-      <w:tr>
-        <w:tc>
-          <w:tcPr>
-            <w:tcW w:type="dxa" w:w="1520"/>
-          </w:tcPr>
-          <w:p/>
-        </w:tc>
-        <w:tc>
-          <w:tcPr>
-            <w:tcW w:type="dxa" w:w="1520"/>
-          </w:tcPr>
           <w:p>
             <w:pPr>
               <w:jc w:val="center"/>
@@ -4099,44 +2497,6 @@
               <w:t>2.094</w:t>
             </w:r>
           </w:p>
-        </w:tc>
-        <w:tc>
-          <w:tcPr>
-            <w:tcW w:type="dxa" w:w="1520"/>
-          </w:tcPr>
-          <w:p/>
-        </w:tc>
-        <w:tc>
-          <w:tcPr>
-            <w:tcW w:type="dxa" w:w="1520"/>
-          </w:tcPr>
-          <w:p/>
-        </w:tc>
-        <w:tc>
-          <w:tcPr>
-            <w:tcW w:type="dxa" w:w="1520"/>
-          </w:tcPr>
-          <w:p/>
-        </w:tc>
-        <w:tc>
-          <w:tcPr>
-            <w:tcW w:type="dxa" w:w="1520"/>
-          </w:tcPr>
-          <w:p/>
-        </w:tc>
-      </w:tr>
-      <w:tr>
-        <w:tc>
-          <w:tcPr>
-            <w:tcW w:type="dxa" w:w="1520"/>
-          </w:tcPr>
-          <w:p/>
-        </w:tc>
-        <w:tc>
-          <w:tcPr>
-            <w:tcW w:type="dxa" w:w="1520"/>
-          </w:tcPr>
-          <w:p/>
         </w:tc>
         <w:tc>
           <w:tcPr>
@@ -4161,44 +2521,6 @@
           <w:tcPr>
             <w:tcW w:type="dxa" w:w="1520"/>
           </w:tcPr>
-          <w:p/>
-        </w:tc>
-        <w:tc>
-          <w:tcPr>
-            <w:tcW w:type="dxa" w:w="1520"/>
-          </w:tcPr>
-          <w:p/>
-        </w:tc>
-        <w:tc>
-          <w:tcPr>
-            <w:tcW w:type="dxa" w:w="1520"/>
-          </w:tcPr>
-          <w:p/>
-        </w:tc>
-      </w:tr>
-      <w:tr>
-        <w:tc>
-          <w:tcPr>
-            <w:tcW w:type="dxa" w:w="1520"/>
-          </w:tcPr>
-          <w:p/>
-        </w:tc>
-        <w:tc>
-          <w:tcPr>
-            <w:tcW w:type="dxa" w:w="1520"/>
-          </w:tcPr>
-          <w:p/>
-        </w:tc>
-        <w:tc>
-          <w:tcPr>
-            <w:tcW w:type="dxa" w:w="1520"/>
-          </w:tcPr>
-          <w:p/>
-        </w:tc>
-        <w:tc>
-          <w:tcPr>
-            <w:tcW w:type="dxa" w:w="1520"/>
-          </w:tcPr>
           <w:p>
             <w:pPr>
               <w:jc w:val="center"/>
@@ -4218,44 +2540,6 @@
           <w:tcPr>
             <w:tcW w:type="dxa" w:w="1520"/>
           </w:tcPr>
-          <w:p/>
-        </w:tc>
-        <w:tc>
-          <w:tcPr>
-            <w:tcW w:type="dxa" w:w="1520"/>
-          </w:tcPr>
-          <w:p/>
-        </w:tc>
-      </w:tr>
-      <w:tr>
-        <w:tc>
-          <w:tcPr>
-            <w:tcW w:type="dxa" w:w="1520"/>
-          </w:tcPr>
-          <w:p/>
-        </w:tc>
-        <w:tc>
-          <w:tcPr>
-            <w:tcW w:type="dxa" w:w="1520"/>
-          </w:tcPr>
-          <w:p/>
-        </w:tc>
-        <w:tc>
-          <w:tcPr>
-            <w:tcW w:type="dxa" w:w="1520"/>
-          </w:tcPr>
-          <w:p/>
-        </w:tc>
-        <w:tc>
-          <w:tcPr>
-            <w:tcW w:type="dxa" w:w="1520"/>
-          </w:tcPr>
-          <w:p/>
-        </w:tc>
-        <w:tc>
-          <w:tcPr>
-            <w:tcW w:type="dxa" w:w="1520"/>
-          </w:tcPr>
           <w:p>
             <w:pPr>
               <w:jc w:val="center"/>
@@ -4267,47 +2551,9 @@
                 <w:b w:val="0"/>
                 <w:sz w:val="21"/>
               </w:rPr>
-              <w:t>0.01440</w:t>
+              <w:t>0.01441</w:t>
             </w:r>
           </w:p>
-        </w:tc>
-        <w:tc>
-          <w:tcPr>
-            <w:tcW w:type="dxa" w:w="1520"/>
-          </w:tcPr>
-          <w:p/>
-        </w:tc>
-      </w:tr>
-      <w:tr>
-        <w:tc>
-          <w:tcPr>
-            <w:tcW w:type="dxa" w:w="1520"/>
-          </w:tcPr>
-          <w:p/>
-        </w:tc>
-        <w:tc>
-          <w:tcPr>
-            <w:tcW w:type="dxa" w:w="1520"/>
-          </w:tcPr>
-          <w:p/>
-        </w:tc>
-        <w:tc>
-          <w:tcPr>
-            <w:tcW w:type="dxa" w:w="1520"/>
-          </w:tcPr>
-          <w:p/>
-        </w:tc>
-        <w:tc>
-          <w:tcPr>
-            <w:tcW w:type="dxa" w:w="1520"/>
-          </w:tcPr>
-          <w:p/>
-        </w:tc>
-        <w:tc>
-          <w:tcPr>
-            <w:tcW w:type="dxa" w:w="1520"/>
-          </w:tcPr>
-          <w:p/>
         </w:tc>
         <w:tc>
           <w:tcPr>
@@ -4353,44 +2599,6 @@
           <w:tcPr>
             <w:tcW w:type="dxa" w:w="1520"/>
           </w:tcPr>
-          <w:p/>
-        </w:tc>
-        <w:tc>
-          <w:tcPr>
-            <w:tcW w:type="dxa" w:w="1520"/>
-          </w:tcPr>
-          <w:p/>
-        </w:tc>
-        <w:tc>
-          <w:tcPr>
-            <w:tcW w:type="dxa" w:w="1520"/>
-          </w:tcPr>
-          <w:p/>
-        </w:tc>
-        <w:tc>
-          <w:tcPr>
-            <w:tcW w:type="dxa" w:w="1520"/>
-          </w:tcPr>
-          <w:p/>
-        </w:tc>
-        <w:tc>
-          <w:tcPr>
-            <w:tcW w:type="dxa" w:w="1520"/>
-          </w:tcPr>
-          <w:p/>
-        </w:tc>
-      </w:tr>
-      <w:tr>
-        <w:tc>
-          <w:tcPr>
-            <w:tcW w:type="dxa" w:w="1520"/>
-          </w:tcPr>
-          <w:p/>
-        </w:tc>
-        <w:tc>
-          <w:tcPr>
-            <w:tcW w:type="dxa" w:w="1520"/>
-          </w:tcPr>
           <w:p>
             <w:pPr>
               <w:jc w:val="center"/>
@@ -4405,44 +2613,6 @@
               <w:t>2.162</w:t>
             </w:r>
           </w:p>
-        </w:tc>
-        <w:tc>
-          <w:tcPr>
-            <w:tcW w:type="dxa" w:w="1520"/>
-          </w:tcPr>
-          <w:p/>
-        </w:tc>
-        <w:tc>
-          <w:tcPr>
-            <w:tcW w:type="dxa" w:w="1520"/>
-          </w:tcPr>
-          <w:p/>
-        </w:tc>
-        <w:tc>
-          <w:tcPr>
-            <w:tcW w:type="dxa" w:w="1520"/>
-          </w:tcPr>
-          <w:p/>
-        </w:tc>
-        <w:tc>
-          <w:tcPr>
-            <w:tcW w:type="dxa" w:w="1520"/>
-          </w:tcPr>
-          <w:p/>
-        </w:tc>
-      </w:tr>
-      <w:tr>
-        <w:tc>
-          <w:tcPr>
-            <w:tcW w:type="dxa" w:w="1520"/>
-          </w:tcPr>
-          <w:p/>
-        </w:tc>
-        <w:tc>
-          <w:tcPr>
-            <w:tcW w:type="dxa" w:w="1520"/>
-          </w:tcPr>
-          <w:p/>
         </w:tc>
         <w:tc>
           <w:tcPr>
@@ -4467,44 +2637,6 @@
           <w:tcPr>
             <w:tcW w:type="dxa" w:w="1520"/>
           </w:tcPr>
-          <w:p/>
-        </w:tc>
-        <w:tc>
-          <w:tcPr>
-            <w:tcW w:type="dxa" w:w="1520"/>
-          </w:tcPr>
-          <w:p/>
-        </w:tc>
-        <w:tc>
-          <w:tcPr>
-            <w:tcW w:type="dxa" w:w="1520"/>
-          </w:tcPr>
-          <w:p/>
-        </w:tc>
-      </w:tr>
-      <w:tr>
-        <w:tc>
-          <w:tcPr>
-            <w:tcW w:type="dxa" w:w="1520"/>
-          </w:tcPr>
-          <w:p/>
-        </w:tc>
-        <w:tc>
-          <w:tcPr>
-            <w:tcW w:type="dxa" w:w="1520"/>
-          </w:tcPr>
-          <w:p/>
-        </w:tc>
-        <w:tc>
-          <w:tcPr>
-            <w:tcW w:type="dxa" w:w="1520"/>
-          </w:tcPr>
-          <w:p/>
-        </w:tc>
-        <w:tc>
-          <w:tcPr>
-            <w:tcW w:type="dxa" w:w="1520"/>
-          </w:tcPr>
           <w:p>
             <w:pPr>
               <w:jc w:val="center"/>
@@ -4524,39 +2656,20 @@
           <w:tcPr>
             <w:tcW w:type="dxa" w:w="1520"/>
           </w:tcPr>
-          <w:p/>
-        </w:tc>
-        <w:tc>
-          <w:tcPr>
-            <w:tcW w:type="dxa" w:w="1520"/>
-          </w:tcPr>
-          <w:p/>
-        </w:tc>
-      </w:tr>
-      <w:tr>
-        <w:tc>
-          <w:tcPr>
-            <w:tcW w:type="dxa" w:w="1520"/>
-          </w:tcPr>
-          <w:p/>
-        </w:tc>
-        <w:tc>
-          <w:tcPr>
-            <w:tcW w:type="dxa" w:w="1520"/>
-          </w:tcPr>
-          <w:p/>
-        </w:tc>
-        <w:tc>
-          <w:tcPr>
-            <w:tcW w:type="dxa" w:w="1520"/>
-          </w:tcPr>
-          <w:p/>
-        </w:tc>
-        <w:tc>
-          <w:tcPr>
-            <w:tcW w:type="dxa" w:w="1520"/>
-          </w:tcPr>
-          <w:p/>
+          <w:p>
+            <w:pPr>
+              <w:jc w:val="center"/>
+            </w:pPr>
+            <w:r/>
+            <w:r>
+              <w:rPr>
+                <w:rFonts w:ascii="Times New Roman" w:hAnsi="Times New Roman" w:eastAsia="宋体"/>
+                <w:b w:val="0"/>
+                <w:sz w:val="21"/>
+              </w:rPr>
+              <w:t>0.01436</w:t>
+            </w:r>
+          </w:p>
         </w:tc>
         <w:tc>
           <w:tcPr>
@@ -4573,64 +2686,7 @@
                 <w:b w:val="0"/>
                 <w:sz w:val="21"/>
               </w:rPr>
-              <w:t>0.01435</w:t>
-            </w:r>
-          </w:p>
-        </w:tc>
-        <w:tc>
-          <w:tcPr>
-            <w:tcW w:type="dxa" w:w="1520"/>
-          </w:tcPr>
-          <w:p/>
-        </w:tc>
-      </w:tr>
-      <w:tr>
-        <w:tc>
-          <w:tcPr>
-            <w:tcW w:type="dxa" w:w="1520"/>
-          </w:tcPr>
-          <w:p/>
-        </w:tc>
-        <w:tc>
-          <w:tcPr>
-            <w:tcW w:type="dxa" w:w="1520"/>
-          </w:tcPr>
-          <w:p/>
-        </w:tc>
-        <w:tc>
-          <w:tcPr>
-            <w:tcW w:type="dxa" w:w="1520"/>
-          </w:tcPr>
-          <w:p/>
-        </w:tc>
-        <w:tc>
-          <w:tcPr>
-            <w:tcW w:type="dxa" w:w="1520"/>
-          </w:tcPr>
-          <w:p/>
-        </w:tc>
-        <w:tc>
-          <w:tcPr>
-            <w:tcW w:type="dxa" w:w="1520"/>
-          </w:tcPr>
-          <w:p/>
-        </w:tc>
-        <w:tc>
-          <w:tcPr>
-            <w:tcW w:type="dxa" w:w="1520"/>
-          </w:tcPr>
-          <w:p>
-            <w:pPr>
-              <w:jc w:val="center"/>
-            </w:pPr>
-            <w:r/>
-            <w:r>
-              <w:rPr>
-                <w:rFonts w:ascii="Times New Roman" w:hAnsi="Times New Roman" w:eastAsia="宋体"/>
-                <w:b w:val="0"/>
-                <w:sz w:val="21"/>
-              </w:rPr>
-              <w:t>0.01450</w:t>
+              <w:t>0.01451</w:t>
             </w:r>
           </w:p>
         </w:tc>
@@ -4649,7 +2705,7 @@
           <w:b w:val="0"/>
           <w:sz w:val="24"/>
         </w:rPr>
-        <w:t>表3和图5的结果表明：在36波长×11温度的全面评估中，三目标优化解在25°C时Total RMSE=0.01435，与2目标解（0.01440）基本持平；在全温域（−10~40°C）平均Total RMSE中，3目标解（0.01450）优于2目标解（0.01476），改善约1.8%。值得注意的是，上述Monte Carlo评估基于完整非线性Haller温漂模型（式(1)）而非优化阶段采用的线性近似，这验证了线性近似优化的结果在实际非线性温漂环境中仍然有效。为进一步评估统计显著性，在550nm单波长下以5000组独立Stokes样本进行了补充分析（采用双侧Welch t-test，不等方差t检验）。需注意，t-test仅覆盖550nm单波长点，而表3为36波长的全波段均值。结果表明：在−10°C极端温下，3目标解RMSE=0.01229，2目标解RMSE=0.01233，差异无统计学意义（p=0.66）；在25°C和40°C下，2目标解RMSE略优（p&lt;0.001），差异幅度约3-4%。这说明在550nm单波长下3目标优化的代价是在室温下牺牲了少量精度以换取温度稳定性。全温域平均RMSE中3目标解优于2目标解（0.01450 vs 0.01476），这是因为全温域多波长均值受低温区域（−10~0°C）的CN恶化贡献更大——在低温区2目标解的平均CN从2.094上升至2.417（Δ=0.323），而3目标解仅上升至2.248（Δ=0.086），因此全波段均值反而改善。综合来看，非线性模型下ΔCN降幅达76.8%，而在相同噪声条件下RMSE改善幅度较小（1.8%），这是因为原系统（2目标解）在室温附近已接近最优工作区，测量误差主要受随机噪声主导。但ΔCN的改善对于保证仪器在宽温域内稳定运行具有重要的工程意义。</w:t>
+        <w:t>表3和图5的结果表明：在36波长×11温度的全面评估中，三目标优化解在25°C时Total RMSE=0.01436，与2目标解（0.01441）和GA基线（0.01415）基本持平；在全温域（−10~40°C）平均Total RMSE中，3目标解（0.01451）优于2目标解（0.01476），与GA基线（0.01435）相当。值得注意的是，上述Monte Carlo评估基于完整非线性Haller温漂模型（式(1)）而非优化阶段采用的线性近似，这验证了线性近似优化的结果在实际非线性温漂环境中仍然有效。从温漂角度（ΔCN）看，单目标CN优化的GA基线ΔCN仅为0.099，说明CN优化本身已具有部分温漂抑制效果；2目标（CN+BCPN）的ΔCN恶化至0.272，这是因为BCPN优化迫使调制态向正交配置靠拢，却牺牲了温度稳定性；3目标重新将ΔCN降至0.063（较GA降低36.4%，较2目标降低76.8%），验证了温漂目标约束的有效性。为进一步评估统计显著性，在550nm单波长下以5000组独立Stokes样本进行了补充分析（采用双侧Welch t-test，不等方差t检验）。需注意，t-test仅覆盖550nm单波长点，而表3为36波长的全波段均值。结果表明：在−10°C极端温下，3目标解RMSE=0.01229，2目标解RMSE=0.01233，差异无统计学意义（p=0.66）；在25°C和40°C下，2目标解RMSE略优（p&lt;0.001），差异幅度约3-4%。这说明在550nm单波长下3目标优化的代价是在室温下牺牲了少量精度以换取温度稳定性。全温域平均RMSE中3目标解优于2目标解（0.01451 vs 0.01476），这是因为全温域多波长均值受低温区域（−10~0°C）的CN恶化贡献更大——在低温区2目标解的CN从2.094上升至2.325（Δ=0.231），而3目标解仅上升至2.222（Δ=0.060），因此全波段均值反而改善。ΔCN的改善对于保证仪器在宽温域内稳定运行具有重要的工程意义。</w:t>
       </w:r>
     </w:p>
     <w:p>

</xml_diff>